<commit_message>
Añadido goger imagenes y sonidos
</commit_message>
<xml_diff>
--- a/REGLAS DEL JUEGO WARHAMMER FORGED IN THE DARK.docx
+++ b/REGLAS DEL JUEGO WARHAMMER FORGED IN THE DARK.docx
@@ -2306,6 +2306,14 @@
         </w:rPr>
         <w:t>RECUERDOS</w:t>
       </w:r>
+      <w:r>
+        <w:rPr>
+          <w:b/>
+          <w:bCs/>
+          <w:u w:val="thick"/>
+        </w:rPr>
+        <w:t xml:space="preserve"> (elige dos)</w:t>
+      </w:r>
     </w:p>
     <w:p>
       <w:pPr>
@@ -3431,6 +3439,22 @@
           <w:bCs/>
         </w:rPr>
         <w:t>Al llegar a 10 en corrupción se gana una ruina y corrupción cero</w:t>
+      </w:r>
+    </w:p>
+    <w:p>
+      <w:pPr>
+        <w:jc w:val="both"/>
+        <w:rPr>
+          <w:b/>
+          <w:bCs/>
+        </w:rPr>
+      </w:pPr>
+      <w:r>
+        <w:rPr>
+          <w:b/>
+          <w:bCs/>
+        </w:rPr>
+        <w:t>Al llegar a 8 en nivel el personaje gana una habilidad especial y nivel cero</w:t>
       </w:r>
     </w:p>
     <w:p>

</xml_diff>